<commit_message>
feat: lock resume skill to canonical template
</commit_message>
<xml_diff>
--- a/outputs/zheng-fawei/resume.docx
+++ b/outputs/zheng-fawei/resume.docx
@@ -4,519 +4,996 @@
   <w:body>
     <w:p>
       <w:pPr>
+        <w:spacing w:after="240"/>
         <w:jc w:val="center"/>
       </w:pPr>
       <w:r>
         <w:rPr>
+          <w:rFonts w:ascii="Arial" w:hAnsi="Arial" w:eastAsia="Arial"/>
           <w:b/>
-          <w:sz w:val="36"/>
+          <w:color w:val="000000"/>
+          <w:sz w:val="32"/>
         </w:rPr>
-        <w:t>郑发炜</w:t>
+        <w:t>全栈开发工程师_郑发炜</w:t>
       </w:r>
     </w:p>
+    <w:tbl>
+      <w:tblPr>
+        <w:tblW w:type="auto" w:w="0"/>
+        <w:tblLook w:firstColumn="1" w:firstRow="1" w:lastColumn="0" w:lastRow="0" w:noHBand="0" w:noVBand="1" w:val="04A0"/>
+      </w:tblPr>
+      <w:tblGrid>
+        <w:gridCol w:w="5100"/>
+        <w:gridCol w:w="5100"/>
+      </w:tblGrid>
+      <w:tr>
+        <w:tc>
+          <w:tcPr>
+            <w:tcW w:type="dxa" w:w="5896"/>
+            <w:tcBorders>
+              <w:top w:val="nil"/>
+              <w:bottom w:val="nil"/>
+              <w:left w:val="nil"/>
+              <w:right w:val="nil"/>
+              <w:insideH w:val="nil"/>
+              <w:insideV w:val="nil"/>
+            </w:tcBorders>
+            <w:shd w:fill="0070C0"/>
+            <w:vAlign w:val="center"/>
+          </w:tcPr>
+          <w:p>
+            <w:pPr>
+              <w:spacing w:after="0"/>
+            </w:pPr>
+            <w:r>
+              <w:rPr>
+                <w:rFonts w:ascii="Microsoft YaHei" w:hAnsi="Microsoft YaHei" w:eastAsia="Microsoft YaHei"/>
+                <w:b w:val="0"/>
+                <w:color w:val="111111"/>
+                <w:sz w:val="2"/>
+              </w:rPr>
+            </w:r>
+          </w:p>
+        </w:tc>
+        <w:tc>
+          <w:tcPr>
+            <w:tcW w:type="dxa" w:w="4025"/>
+            <w:tcBorders>
+              <w:top w:val="nil"/>
+              <w:bottom w:val="nil"/>
+              <w:left w:val="nil"/>
+              <w:right w:val="nil"/>
+              <w:insideH w:val="nil"/>
+              <w:insideV w:val="nil"/>
+            </w:tcBorders>
+            <w:shd w:fill="C8A96A"/>
+            <w:vAlign w:val="center"/>
+          </w:tcPr>
+          <w:p>
+            <w:pPr>
+              <w:spacing w:after="0"/>
+            </w:pPr>
+            <w:r>
+              <w:rPr>
+                <w:rFonts w:ascii="Microsoft YaHei" w:hAnsi="Microsoft YaHei" w:eastAsia="Microsoft YaHei"/>
+                <w:b w:val="0"/>
+                <w:color w:val="111111"/>
+                <w:sz w:val="2"/>
+              </w:rPr>
+            </w:r>
+          </w:p>
+        </w:tc>
+      </w:tr>
+    </w:tbl>
     <w:p>
       <w:pPr>
-        <w:jc w:val="center"/>
+        <w:spacing w:after="160"/>
+      </w:pPr>
+    </w:p>
+    <w:tbl>
+      <w:tblPr>
+        <w:tblW w:type="auto" w:w="0"/>
+        <w:tblLook w:firstColumn="1" w:firstRow="1" w:lastColumn="0" w:lastRow="0" w:noHBand="0" w:noVBand="1" w:val="04A0"/>
+      </w:tblPr>
+      <w:tblGrid>
+        <w:gridCol w:w="5100"/>
+        <w:gridCol w:w="5100"/>
+      </w:tblGrid>
+      <w:tr>
+        <w:trPr>
+          <w:trHeight w:val="312"/>
+        </w:trPr>
+        <w:tc>
+          <w:tcPr>
+            <w:tcW w:type="dxa" w:w="2268"/>
+            <w:tcBorders>
+              <w:top w:val="nil"/>
+              <w:bottom w:val="nil"/>
+              <w:left w:val="nil"/>
+              <w:right w:val="nil"/>
+              <w:insideH w:val="nil"/>
+              <w:insideV w:val="nil"/>
+            </w:tcBorders>
+            <w:shd w:fill="0070C0"/>
+          </w:tcPr>
+          <w:p>
+            <w:pPr>
+              <w:spacing w:after="0"/>
+              <w:jc w:val="center"/>
+            </w:pPr>
+            <w:r>
+              <w:rPr>
+                <w:rFonts w:ascii="Microsoft YaHei" w:hAnsi="Microsoft YaHei" w:eastAsia="Microsoft YaHei"/>
+                <w:b/>
+                <w:color w:val="FFFFFF"/>
+                <w:sz w:val="22"/>
+              </w:rPr>
+              <w:t>基本信息</w:t>
+            </w:r>
+          </w:p>
+        </w:tc>
+        <w:tc>
+          <w:tcPr>
+            <w:tcW w:type="dxa" w:w="7654"/>
+            <w:tcBorders>
+              <w:top w:val="nil"/>
+              <w:bottom w:val="single" w:sz="10" w:space="0" w:color="0070C0"/>
+              <w:left w:val="nil"/>
+              <w:right w:val="nil"/>
+              <w:insideH w:val="nil"/>
+              <w:insideV w:val="nil"/>
+            </w:tcBorders>
+          </w:tcPr>
+          <w:p>
+            <w:pPr>
+              <w:spacing w:after="0"/>
+            </w:pPr>
+            <w:r>
+              <w:rPr>
+                <w:rFonts w:ascii="Microsoft YaHei" w:hAnsi="Microsoft YaHei" w:eastAsia="Microsoft YaHei"/>
+                <w:b w:val="0"/>
+                <w:color w:val="111111"/>
+                <w:sz w:val="2"/>
+              </w:rPr>
+            </w:r>
+          </w:p>
+        </w:tc>
+      </w:tr>
+    </w:tbl>
+    <w:tbl>
+      <w:tblPr>
+        <w:tblW w:type="auto" w:w="0"/>
+        <w:tblLook w:firstColumn="1" w:firstRow="1" w:lastColumn="0" w:lastRow="0" w:noHBand="0" w:noVBand="1" w:val="04A0"/>
+      </w:tblPr>
+      <w:tblGrid>
+        <w:gridCol w:w="5100"/>
+        <w:gridCol w:w="5100"/>
+      </w:tblGrid>
+      <w:tr>
+        <w:tc>
+          <w:tcPr>
+            <w:tcW w:type="dxa" w:w="4876"/>
+          </w:tcPr>
+          <w:p>
+            <w:pPr>
+              <w:spacing w:after="0"/>
+            </w:pPr>
+            <w:r>
+              <w:rPr>
+                <w:rFonts w:ascii="Microsoft YaHei" w:hAnsi="Microsoft YaHei" w:eastAsia="Microsoft YaHei"/>
+                <w:b w:val="0"/>
+                <w:color w:val="111111"/>
+                <w:sz w:val="20"/>
+              </w:rPr>
+              <w:t>姓名：郑发炜</w:t>
+            </w:r>
+          </w:p>
+        </w:tc>
+        <w:tc>
+          <w:tcPr>
+            <w:tcW w:type="dxa" w:w="4876"/>
+          </w:tcPr>
+          <w:p>
+            <w:pPr>
+              <w:spacing w:after="0"/>
+            </w:pPr>
+            <w:r>
+              <w:rPr>
+                <w:rFonts w:ascii="Microsoft YaHei" w:hAnsi="Microsoft YaHei" w:eastAsia="Microsoft YaHei"/>
+                <w:b w:val="0"/>
+                <w:color w:val="111111"/>
+                <w:sz w:val="20"/>
+              </w:rPr>
+              <w:t>专业背景：软件工程</w:t>
+            </w:r>
+          </w:p>
+        </w:tc>
+      </w:tr>
+    </w:tbl>
+    <w:p>
+      <w:pPr>
+        <w:spacing w:after="40"/>
+      </w:pPr>
+    </w:p>
+    <w:tbl>
+      <w:tblPr>
+        <w:tblW w:type="auto" w:w="0"/>
+        <w:tblLook w:firstColumn="1" w:firstRow="1" w:lastColumn="0" w:lastRow="0" w:noHBand="0" w:noVBand="1" w:val="04A0"/>
+      </w:tblPr>
+      <w:tblGrid>
+        <w:gridCol w:w="5100"/>
+        <w:gridCol w:w="5100"/>
+      </w:tblGrid>
+      <w:tr>
+        <w:trPr>
+          <w:trHeight w:val="312"/>
+        </w:trPr>
+        <w:tc>
+          <w:tcPr>
+            <w:tcW w:type="dxa" w:w="2268"/>
+            <w:tcBorders>
+              <w:top w:val="nil"/>
+              <w:bottom w:val="nil"/>
+              <w:left w:val="nil"/>
+              <w:right w:val="nil"/>
+              <w:insideH w:val="nil"/>
+              <w:insideV w:val="nil"/>
+            </w:tcBorders>
+            <w:shd w:fill="0070C0"/>
+          </w:tcPr>
+          <w:p>
+            <w:pPr>
+              <w:spacing w:after="0"/>
+              <w:jc w:val="center"/>
+            </w:pPr>
+            <w:r>
+              <w:rPr>
+                <w:rFonts w:ascii="Microsoft YaHei" w:hAnsi="Microsoft YaHei" w:eastAsia="Microsoft YaHei"/>
+                <w:b/>
+                <w:color w:val="FFFFFF"/>
+                <w:sz w:val="22"/>
+              </w:rPr>
+              <w:t>求职意向</w:t>
+            </w:r>
+          </w:p>
+        </w:tc>
+        <w:tc>
+          <w:tcPr>
+            <w:tcW w:type="dxa" w:w="7654"/>
+            <w:tcBorders>
+              <w:top w:val="nil"/>
+              <w:bottom w:val="single" w:sz="10" w:space="0" w:color="0070C0"/>
+              <w:left w:val="nil"/>
+              <w:right w:val="nil"/>
+              <w:insideH w:val="nil"/>
+              <w:insideV w:val="nil"/>
+            </w:tcBorders>
+          </w:tcPr>
+          <w:p>
+            <w:pPr>
+              <w:spacing w:after="0"/>
+            </w:pPr>
+            <w:r>
+              <w:rPr>
+                <w:rFonts w:ascii="Microsoft YaHei" w:hAnsi="Microsoft YaHei" w:eastAsia="Microsoft YaHei"/>
+                <w:b w:val="0"/>
+                <w:color w:val="111111"/>
+                <w:sz w:val="2"/>
+              </w:rPr>
+            </w:r>
+          </w:p>
+        </w:tc>
+      </w:tr>
+    </w:tbl>
+    <w:tbl>
+      <w:tblPr>
+        <w:tblW w:type="auto" w:w="0"/>
+        <w:tblLook w:firstColumn="1" w:firstRow="1" w:lastColumn="0" w:lastRow="0" w:noHBand="0" w:noVBand="1" w:val="04A0"/>
+      </w:tblPr>
+      <w:tblGrid>
+        <w:gridCol w:w="5100"/>
+        <w:gridCol w:w="5100"/>
+      </w:tblGrid>
+      <w:tr>
+        <w:tc>
+          <w:tcPr>
+            <w:tcW w:type="dxa" w:w="4876"/>
+          </w:tcPr>
+          <w:p>
+            <w:pPr>
+              <w:spacing w:after="0"/>
+            </w:pPr>
+            <w:r>
+              <w:rPr>
+                <w:rFonts w:ascii="Microsoft YaHei" w:hAnsi="Microsoft YaHei" w:eastAsia="Microsoft YaHei"/>
+                <w:b w:val="0"/>
+                <w:color w:val="111111"/>
+                <w:sz w:val="20"/>
+              </w:rPr>
+              <w:t>目标职位：全栈开发工程师</w:t>
+            </w:r>
+          </w:p>
+        </w:tc>
+        <w:tc>
+          <w:tcPr>
+            <w:tcW w:type="dxa" w:w="4876"/>
+          </w:tcPr>
+          <w:p>
+            <w:pPr>
+              <w:spacing w:after="0"/>
+            </w:pPr>
+            <w:r>
+              <w:rPr>
+                <w:rFonts w:ascii="Microsoft YaHei" w:hAnsi="Microsoft YaHei" w:eastAsia="Microsoft YaHei"/>
+                <w:b w:val="0"/>
+                <w:color w:val="111111"/>
+                <w:sz w:val="20"/>
+              </w:rPr>
+            </w:r>
+          </w:p>
+        </w:tc>
+      </w:tr>
+    </w:tbl>
+    <w:p>
+      <w:pPr>
+        <w:spacing w:after="40"/>
+      </w:pPr>
+    </w:p>
+    <w:tbl>
+      <w:tblPr>
+        <w:tblW w:type="auto" w:w="0"/>
+        <w:tblLook w:firstColumn="1" w:firstRow="1" w:lastColumn="0" w:lastRow="0" w:noHBand="0" w:noVBand="1" w:val="04A0"/>
+      </w:tblPr>
+      <w:tblGrid>
+        <w:gridCol w:w="5100"/>
+        <w:gridCol w:w="5100"/>
+      </w:tblGrid>
+      <w:tr>
+        <w:trPr>
+          <w:trHeight w:val="312"/>
+        </w:trPr>
+        <w:tc>
+          <w:tcPr>
+            <w:tcW w:type="dxa" w:w="2268"/>
+            <w:tcBorders>
+              <w:top w:val="nil"/>
+              <w:bottom w:val="nil"/>
+              <w:left w:val="nil"/>
+              <w:right w:val="nil"/>
+              <w:insideH w:val="nil"/>
+              <w:insideV w:val="nil"/>
+            </w:tcBorders>
+            <w:shd w:fill="0070C0"/>
+          </w:tcPr>
+          <w:p>
+            <w:pPr>
+              <w:spacing w:after="0"/>
+              <w:jc w:val="center"/>
+            </w:pPr>
+            <w:r>
+              <w:rPr>
+                <w:rFonts w:ascii="Microsoft YaHei" w:hAnsi="Microsoft YaHei" w:eastAsia="Microsoft YaHei"/>
+                <w:b/>
+                <w:color w:val="FFFFFF"/>
+                <w:sz w:val="22"/>
+              </w:rPr>
+              <w:t>开发技能</w:t>
+            </w:r>
+          </w:p>
+        </w:tc>
+        <w:tc>
+          <w:tcPr>
+            <w:tcW w:type="dxa" w:w="7654"/>
+            <w:tcBorders>
+              <w:top w:val="nil"/>
+              <w:bottom w:val="single" w:sz="10" w:space="0" w:color="0070C0"/>
+              <w:left w:val="nil"/>
+              <w:right w:val="nil"/>
+              <w:insideH w:val="nil"/>
+              <w:insideV w:val="nil"/>
+            </w:tcBorders>
+          </w:tcPr>
+          <w:p>
+            <w:pPr>
+              <w:spacing w:after="0"/>
+            </w:pPr>
+            <w:r>
+              <w:rPr>
+                <w:rFonts w:ascii="Microsoft YaHei" w:hAnsi="Microsoft YaHei" w:eastAsia="Microsoft YaHei"/>
+                <w:b w:val="0"/>
+                <w:color w:val="111111"/>
+                <w:sz w:val="2"/>
+              </w:rPr>
+            </w:r>
+          </w:p>
+        </w:tc>
+      </w:tr>
+    </w:tbl>
+    <w:p>
+      <w:pPr>
+        <w:spacing w:after="40"/>
+        <w:ind w:left="425" w:hanging="198"/>
       </w:pPr>
       <w:r>
         <w:rPr>
+          <w:rFonts w:ascii="Microsoft YaHei" w:hAnsi="Microsoft YaHei" w:eastAsia="Microsoft YaHei"/>
           <w:b/>
+          <w:color w:val="000000"/>
+          <w:sz w:val="18"/>
         </w:rPr>
-        <w:t>求职意向：全栈开发工程师</w:t>
+        <w:t xml:space="preserve">➢  </w:t>
       </w:r>
-    </w:p>
-    <w:p>
-      <w:pPr>
-        <w:spacing w:before="160" w:after="60"/>
-      </w:pPr>
       <w:r>
         <w:rPr>
-          <w:b/>
-          <w:sz w:val="22"/>
+          <w:rFonts w:ascii="Microsoft YaHei" w:hAnsi="Microsoft YaHei" w:eastAsia="Microsoft YaHei"/>
+          <w:b w:val="0"/>
+          <w:color w:val="000000"/>
+          <w:sz w:val="18"/>
         </w:rPr>
-        <w:t>个人优势</w:t>
-      </w:r>
-    </w:p>
-    <w:p>
-      <w:pPr>
-        <w:spacing w:after="20"/>
-        <w:ind w:left="170" w:hanging="170"/>
-      </w:pPr>
-      <w:r>
-        <w:rPr>
-          <w:b/>
-        </w:rPr>
-        <w:t xml:space="preserve">• </w:t>
-      </w:r>
-      <w:r>
-        <w:t>软件工程专业背景，面向 Java Spring Boot 与 Vue/React 全栈开发；本地项目覆盖 SaaS 低代码平台、ERP 管理系统、养老服务平台、国学知识库应用和 Spring Cloud 服务调用示例，熟悉前后端分离、模块化后端服务、权限认证、文件存储、业务管理后台和容器化部署链路。</w:t>
-      </w:r>
-    </w:p>
-    <w:p>
-      <w:pPr>
-        <w:spacing w:before="160" w:after="60"/>
-      </w:pPr>
-      <w:r>
-        <w:rPr>
-          <w:b/>
-          <w:sz w:val="22"/>
-        </w:rPr>
-        <w:t>专业技能</w:t>
-      </w:r>
-    </w:p>
-    <w:p>
-      <w:pPr>
-        <w:spacing w:after="20"/>
-        <w:ind w:left="170" w:hanging="170"/>
-      </w:pPr>
-      <w:r>
-        <w:rPr>
-          <w:b/>
-        </w:rPr>
-        <w:t xml:space="preserve">• </w:t>
-      </w:r>
-      <w:r>
         <w:t>编程语言：Java、JavaScript、TypeScript、SQL</w:t>
       </w:r>
     </w:p>
     <w:p>
       <w:pPr>
-        <w:spacing w:after="20"/>
-        <w:ind w:left="170" w:hanging="170"/>
+        <w:spacing w:after="40"/>
+        <w:ind w:left="425" w:hanging="198"/>
       </w:pPr>
       <w:r>
         <w:rPr>
+          <w:rFonts w:ascii="Microsoft YaHei" w:hAnsi="Microsoft YaHei" w:eastAsia="Microsoft YaHei"/>
           <w:b/>
+          <w:color w:val="000000"/>
+          <w:sz w:val="18"/>
         </w:rPr>
-        <w:t xml:space="preserve">• </w:t>
+        <w:t xml:space="preserve">➢  </w:t>
       </w:r>
       <w:r>
-        <w:t>后端框架：Spring Boot、Spring Security、Spring Cloud、Spring Cloud Alibaba、MyBatis、MyBatis-Plus、Spring Data JPA</w:t>
+        <w:rPr>
+          <w:rFonts w:ascii="Microsoft YaHei" w:hAnsi="Microsoft YaHei" w:eastAsia="Microsoft YaHei"/>
+          <w:b w:val="0"/>
+          <w:color w:val="000000"/>
+          <w:sz w:val="18"/>
+        </w:rPr>
+        <w:t>后端框架：Spring Boot、Spring Security、Spring Cloud、MyBatis、MyBatis-Plus、Spring Data JPA</w:t>
       </w:r>
     </w:p>
     <w:p>
       <w:pPr>
-        <w:spacing w:after="20"/>
-        <w:ind w:left="170" w:hanging="170"/>
+        <w:spacing w:after="40"/>
+        <w:ind w:left="425" w:hanging="198"/>
       </w:pPr>
       <w:r>
         <w:rPr>
+          <w:rFonts w:ascii="Microsoft YaHei" w:hAnsi="Microsoft YaHei" w:eastAsia="Microsoft YaHei"/>
           <w:b/>
+          <w:color w:val="000000"/>
+          <w:sz w:val="18"/>
         </w:rPr>
-        <w:t xml:space="preserve">• </w:t>
+        <w:t xml:space="preserve">➢  </w:t>
       </w:r>
       <w:r>
-        <w:t>前端技术：Vue 3、Vite、Element Plus、Pinia、Vue Router、React、Next.js、shadcn/ui、Tailwind CSS、微信小程序</w:t>
+        <w:rPr>
+          <w:rFonts w:ascii="Microsoft YaHei" w:hAnsi="Microsoft YaHei" w:eastAsia="Microsoft YaHei"/>
+          <w:b w:val="0"/>
+          <w:color w:val="000000"/>
+          <w:sz w:val="18"/>
+        </w:rPr>
+        <w:t>前端技术：Vue 3、Vite、Element Plus、Pinia、Vue Router、React、Next.js、Tailwind CSS、微信小程序</w:t>
       </w:r>
     </w:p>
     <w:p>
       <w:pPr>
-        <w:spacing w:after="20"/>
-        <w:ind w:left="170" w:hanging="170"/>
+        <w:spacing w:after="40"/>
+        <w:ind w:left="425" w:hanging="198"/>
       </w:pPr>
       <w:r>
         <w:rPr>
+          <w:rFonts w:ascii="Microsoft YaHei" w:hAnsi="Microsoft YaHei" w:eastAsia="Microsoft YaHei"/>
           <w:b/>
+          <w:color w:val="000000"/>
+          <w:sz w:val="18"/>
         </w:rPr>
-        <w:t xml:space="preserve">• </w:t>
+        <w:t xml:space="preserve">➢  </w:t>
       </w:r>
       <w:r>
+        <w:rPr>
+          <w:rFonts w:ascii="Microsoft YaHei" w:hAnsi="Microsoft YaHei" w:eastAsia="Microsoft YaHei"/>
+          <w:b w:val="0"/>
+          <w:color w:val="000000"/>
+          <w:sz w:val="18"/>
+        </w:rPr>
         <w:t>数据库：MySQL、Redis、PostgreSQL</w:t>
       </w:r>
     </w:p>
     <w:p>
       <w:pPr>
-        <w:spacing w:after="20"/>
-        <w:ind w:left="170" w:hanging="170"/>
+        <w:spacing w:after="40"/>
+        <w:ind w:left="425" w:hanging="198"/>
       </w:pPr>
       <w:r>
         <w:rPr>
+          <w:rFonts w:ascii="Microsoft YaHei" w:hAnsi="Microsoft YaHei" w:eastAsia="Microsoft YaHei"/>
           <w:b/>
+          <w:color w:val="000000"/>
+          <w:sz w:val="18"/>
         </w:rPr>
-        <w:t xml:space="preserve">• </w:t>
+        <w:t xml:space="preserve">➢  </w:t>
       </w:r>
       <w:r>
+        <w:rPr>
+          <w:rFonts w:ascii="Microsoft YaHei" w:hAnsi="Microsoft YaHei" w:eastAsia="Microsoft YaHei"/>
+          <w:b w:val="0"/>
+          <w:color w:val="000000"/>
+          <w:sz w:val="18"/>
+        </w:rPr>
         <w:t>工具平台：Maven、Docker Compose、Nginx、Git、Knife4j、Axios</w:t>
       </w:r>
     </w:p>
+    <w:tbl>
+      <w:tblPr>
+        <w:tblW w:type="auto" w:w="0"/>
+        <w:tblLook w:firstColumn="1" w:firstRow="1" w:lastColumn="0" w:lastRow="0" w:noHBand="0" w:noVBand="1" w:val="04A0"/>
+      </w:tblPr>
+      <w:tblGrid>
+        <w:gridCol w:w="5100"/>
+        <w:gridCol w:w="5100"/>
+      </w:tblGrid>
+      <w:tr>
+        <w:trPr>
+          <w:trHeight w:val="312"/>
+        </w:trPr>
+        <w:tc>
+          <w:tcPr>
+            <w:tcW w:type="dxa" w:w="2268"/>
+            <w:tcBorders>
+              <w:top w:val="nil"/>
+              <w:bottom w:val="nil"/>
+              <w:left w:val="nil"/>
+              <w:right w:val="nil"/>
+              <w:insideH w:val="nil"/>
+              <w:insideV w:val="nil"/>
+            </w:tcBorders>
+            <w:shd w:fill="0070C0"/>
+          </w:tcPr>
+          <w:p>
+            <w:pPr>
+              <w:spacing w:after="0"/>
+              <w:jc w:val="center"/>
+            </w:pPr>
+            <w:r>
+              <w:rPr>
+                <w:rFonts w:ascii="Microsoft YaHei" w:hAnsi="Microsoft YaHei" w:eastAsia="Microsoft YaHei"/>
+                <w:b/>
+                <w:color w:val="FFFFFF"/>
+                <w:sz w:val="22"/>
+              </w:rPr>
+              <w:t>项目经历</w:t>
+            </w:r>
+          </w:p>
+        </w:tc>
+        <w:tc>
+          <w:tcPr>
+            <w:tcW w:type="dxa" w:w="7654"/>
+            <w:tcBorders>
+              <w:top w:val="nil"/>
+              <w:bottom w:val="single" w:sz="10" w:space="0" w:color="0070C0"/>
+              <w:left w:val="nil"/>
+              <w:right w:val="nil"/>
+              <w:insideH w:val="nil"/>
+              <w:insideV w:val="nil"/>
+            </w:tcBorders>
+          </w:tcPr>
+          <w:p>
+            <w:pPr>
+              <w:spacing w:after="0"/>
+            </w:pPr>
+            <w:r>
+              <w:rPr>
+                <w:rFonts w:ascii="Microsoft YaHei" w:hAnsi="Microsoft YaHei" w:eastAsia="Microsoft YaHei"/>
+                <w:b w:val="0"/>
+                <w:color w:val="111111"/>
+                <w:sz w:val="2"/>
+              </w:rPr>
+            </w:r>
+          </w:p>
+        </w:tc>
+      </w:tr>
+    </w:tbl>
     <w:p>
       <w:pPr>
-        <w:spacing w:before="160" w:after="60"/>
+        <w:spacing w:before="60" w:after="40"/>
       </w:pPr>
       <w:r>
         <w:rPr>
+          <w:rFonts w:ascii="Microsoft YaHei" w:hAnsi="Microsoft YaHei" w:eastAsia="Microsoft YaHei"/>
           <w:b/>
-          <w:sz w:val="22"/>
-        </w:rPr>
-        <w:t>项目经历</w:t>
-      </w:r>
-    </w:p>
-    <w:p>
-      <w:pPr>
-        <w:spacing w:after="20"/>
-      </w:pPr>
-      <w:r>
-        <w:rPr>
-          <w:b/>
+          <w:color w:val="111111"/>
+          <w:sz w:val="20"/>
         </w:rPr>
         <w:t>dmmx-SAAS 低代码 SaaS 平台    全栈开发</w:t>
       </w:r>
     </w:p>
     <w:p>
       <w:pPr>
-        <w:spacing w:after="20"/>
-        <w:ind w:left="170" w:hanging="170"/>
+        <w:spacing w:after="40"/>
+        <w:ind w:left="425" w:hanging="198"/>
       </w:pPr>
       <w:r>
         <w:rPr>
+          <w:rFonts w:ascii="Microsoft YaHei" w:hAnsi="Microsoft YaHei" w:eastAsia="Microsoft YaHei"/>
           <w:b/>
+          <w:color w:val="000000"/>
+          <w:sz w:val="16"/>
         </w:rPr>
-        <w:t xml:space="preserve">• </w:t>
+        <w:t xml:space="preserve">➢  </w:t>
       </w:r>
       <w:r>
-        <w:t>技术栈：Java、Spring Boot、MyBatis-Plus、MySQL、Redis、Vue 3、TypeScript、Vite、Element Plus、Pinia、Docker Compose、Nginx</w:t>
+        <w:rPr>
+          <w:rFonts w:ascii="Microsoft YaHei" w:hAnsi="Microsoft YaHei" w:eastAsia="Microsoft YaHei"/>
+          <w:b w:val="0"/>
+          <w:color w:val="000000"/>
+          <w:sz w:val="16"/>
+        </w:rPr>
+        <w:t>技术栈：Spring Boot、MyBatis-Plus、MySQL、Redis、Vue 3、TypeScript、Element Plus、Pinia、Docker Compose</w:t>
       </w:r>
     </w:p>
     <w:p>
       <w:pPr>
-        <w:spacing w:after="20"/>
-        <w:ind w:left="170" w:hanging="170"/>
+        <w:spacing w:after="40"/>
+        <w:ind w:left="425" w:hanging="198"/>
       </w:pPr>
       <w:r>
         <w:rPr>
+          <w:rFonts w:ascii="Microsoft YaHei" w:hAnsi="Microsoft YaHei" w:eastAsia="Microsoft YaHei"/>
           <w:b/>
+          <w:color w:val="000000"/>
+          <w:sz w:val="16"/>
         </w:rPr>
-        <w:t xml:space="preserve">• </w:t>
+        <w:t xml:space="preserve">➢  </w:t>
       </w:r>
       <w:r>
-        <w:t>参与低代码 SaaS 平台全栈实现，后端按 system、lowcode、dashboard、business、behavior、survey、file、formula 等模块拆分，前端基于 Vue 3、Vite、Element Plus、Pinia 组织管理端页面。</w:t>
+        <w:rPr>
+          <w:rFonts w:ascii="Microsoft YaHei" w:hAnsi="Microsoft YaHei" w:eastAsia="Microsoft YaHei"/>
+          <w:b w:val="0"/>
+          <w:color w:val="000000"/>
+          <w:sz w:val="16"/>
+        </w:rPr>
+        <w:t>参与低代码 SaaS 平台全栈实现，后端按 system、lowcode、dashboard、business、behavior、survey、file、formula 等模块拆分，前端基于 Vue 3 与 Element Plus 构建管理端。</w:t>
       </w:r>
     </w:p>
     <w:p>
       <w:pPr>
-        <w:spacing w:after="20"/>
-        <w:ind w:left="170" w:hanging="170"/>
+        <w:spacing w:after="40"/>
+        <w:ind w:left="425" w:hanging="198"/>
       </w:pPr>
       <w:r>
         <w:rPr>
+          <w:rFonts w:ascii="Microsoft YaHei" w:hAnsi="Microsoft YaHei" w:eastAsia="Microsoft YaHei"/>
           <w:b/>
+          <w:color w:val="000000"/>
+          <w:sz w:val="16"/>
         </w:rPr>
-        <w:t xml:space="preserve">• </w:t>
+        <w:t xml:space="preserve">➢  </w:t>
       </w:r>
       <w:r>
-        <w:t>实现并维护低代码页面搭建、动态表格运行时、流程设计、租户与角色菜单权限、文件资产、问卷和业务订单等模块，按 api/system、api/lowcode、api/files、api/survey、api/business 等前端接口目录进行联调。</w:t>
+        <w:rPr>
+          <w:rFonts w:ascii="Microsoft YaHei" w:hAnsi="Microsoft YaHei" w:eastAsia="Microsoft YaHei"/>
+          <w:b w:val="0"/>
+          <w:color w:val="000000"/>
+          <w:sz w:val="16"/>
+        </w:rPr>
+        <w:t>实现低代码页面搭建、动态表格运行时、流程设计、租户与角色菜单权限、文件资产、问卷和业务订单等模块，并维护 api/system、api/lowcode、api/files 等前端接口联调。</w:t>
       </w:r>
     </w:p>
     <w:p>
       <w:pPr>
-        <w:spacing w:after="20"/>
-        <w:ind w:left="170" w:hanging="170"/>
+        <w:spacing w:after="40"/>
+        <w:ind w:left="425" w:hanging="198"/>
       </w:pPr>
       <w:r>
         <w:rPr>
+          <w:rFonts w:ascii="Microsoft YaHei" w:hAnsi="Microsoft YaHei" w:eastAsia="Microsoft YaHei"/>
           <w:b/>
+          <w:color w:val="000000"/>
+          <w:sz w:val="16"/>
         </w:rPr>
-        <w:t xml:space="preserve">• </w:t>
+        <w:t xml:space="preserve">➢  </w:t>
       </w:r>
       <w:r>
-        <w:t>整理 Docker Compose 一键部署链路，使用 Nginx 托管前端静态资源并反向代理 `/api`，组合 Spring Boot 后端、MySQL 8.4、Redis 7.2 容器，并保留数据库初始化 SQL 与镜像导出脚本。</w:t>
+        <w:rPr>
+          <w:rFonts w:ascii="Microsoft YaHei" w:hAnsi="Microsoft YaHei" w:eastAsia="Microsoft YaHei"/>
+          <w:b w:val="0"/>
+          <w:color w:val="000000"/>
+          <w:sz w:val="16"/>
+        </w:rPr>
+        <w:t>整理 Docker Compose 部署链路，使用 Nginx 托管前端静态资源并反向代理 /api，组合 Spring Boot、MySQL 8.4 与 Redis 7.2。</w:t>
       </w:r>
     </w:p>
     <w:p>
       <w:pPr>
-        <w:spacing w:after="20"/>
+        <w:spacing w:before="60" w:after="40"/>
       </w:pPr>
       <w:r>
         <w:rPr>
+          <w:rFonts w:ascii="Microsoft YaHei" w:hAnsi="Microsoft YaHei" w:eastAsia="Microsoft YaHei"/>
           <w:b/>
+          <w:color w:val="111111"/>
+          <w:sz w:val="20"/>
         </w:rPr>
         <w:t>ERP 企业资源管理系统    全栈开发</w:t>
       </w:r>
     </w:p>
     <w:p>
       <w:pPr>
-        <w:spacing w:after="20"/>
-        <w:ind w:left="170" w:hanging="170"/>
+        <w:spacing w:after="40"/>
+        <w:ind w:left="425" w:hanging="198"/>
       </w:pPr>
       <w:r>
         <w:rPr>
+          <w:rFonts w:ascii="Microsoft YaHei" w:hAnsi="Microsoft YaHei" w:eastAsia="Microsoft YaHei"/>
           <w:b/>
+          <w:color w:val="000000"/>
+          <w:sz w:val="16"/>
         </w:rPr>
-        <w:t xml:space="preserve">• </w:t>
+        <w:t xml:space="preserve">➢  </w:t>
       </w:r>
       <w:r>
-        <w:t>技术栈：Java、Spring Boot、MyBatis-Plus、MySQL、Redis、Vue 3、Vite、Element Plus、Pinia、Knife4j</w:t>
+        <w:rPr>
+          <w:rFonts w:ascii="Microsoft YaHei" w:hAnsi="Microsoft YaHei" w:eastAsia="Microsoft YaHei"/>
+          <w:b w:val="0"/>
+          <w:color w:val="000000"/>
+          <w:sz w:val="16"/>
+        </w:rPr>
+        <w:t>技术栈：Spring Boot、MyBatis-Plus、MySQL、Redis、Vue 3、Vite、Element Plus、Pinia、Knife4j</w:t>
       </w:r>
     </w:p>
     <w:p>
       <w:pPr>
-        <w:spacing w:after="20"/>
-        <w:ind w:left="170" w:hanging="170"/>
+        <w:spacing w:after="40"/>
+        <w:ind w:left="425" w:hanging="198"/>
       </w:pPr>
       <w:r>
         <w:rPr>
+          <w:rFonts w:ascii="Microsoft YaHei" w:hAnsi="Microsoft YaHei" w:eastAsia="Microsoft YaHei"/>
           <w:b/>
+          <w:color w:val="000000"/>
+          <w:sz w:val="16"/>
         </w:rPr>
-        <w:t xml:space="preserve">• </w:t>
+        <w:t xml:space="preserve">➢  </w:t>
       </w:r>
       <w:r>
-        <w:t>参与 ERP 系统全栈开发，后端按 admin、product、order、customer、aftersale、stats、chat、security、system 等 Maven 模块组织，前端以 Vue 3、Vite、Element Plus 构建业务管理界面。</w:t>
+        <w:rPr>
+          <w:rFonts w:ascii="Microsoft YaHei" w:hAnsi="Microsoft YaHei" w:eastAsia="Microsoft YaHei"/>
+          <w:b w:val="0"/>
+          <w:color w:val="000000"/>
+          <w:sz w:val="16"/>
+        </w:rPr>
+        <w:t>参与 ERP 系统开发，后端按 admin、product、order、customer、aftersale、stats、chat、security、system 等 Maven 模块组织，前端构建业务管理界面。</w:t>
       </w:r>
     </w:p>
     <w:p>
       <w:pPr>
-        <w:spacing w:after="20"/>
-        <w:ind w:left="170" w:hanging="170"/>
+        <w:spacing w:after="40"/>
+        <w:ind w:left="425" w:hanging="198"/>
       </w:pPr>
       <w:r>
         <w:rPr>
+          <w:rFonts w:ascii="Microsoft YaHei" w:hAnsi="Microsoft YaHei" w:eastAsia="Microsoft YaHei"/>
           <w:b/>
+          <w:color w:val="000000"/>
+          <w:sz w:val="16"/>
         </w:rPr>
-        <w:t xml:space="preserve">• </w:t>
+        <w:t xml:space="preserve">➢  </w:t>
       </w:r>
       <w:r>
+        <w:rPr>
+          <w:rFonts w:ascii="Microsoft YaHei" w:hAnsi="Microsoft YaHei" w:eastAsia="Microsoft YaHei"/>
+          <w:b w:val="0"/>
+          <w:color w:val="000000"/>
+          <w:sz w:val="16"/>
+        </w:rPr>
         <w:t>维护仓储、采购、库存、商品、订单、客户、发票、售后、看板、权限和聊天等页面与 API 对接，使用 Axios、Vue Router、Pinia 管理请求、路由和状态。</w:t>
       </w:r>
     </w:p>
     <w:p>
       <w:pPr>
-        <w:spacing w:after="20"/>
-        <w:ind w:left="170" w:hanging="170"/>
+        <w:spacing w:after="40"/>
+        <w:ind w:left="425" w:hanging="198"/>
       </w:pPr>
       <w:r>
         <w:rPr>
+          <w:rFonts w:ascii="Microsoft YaHei" w:hAnsi="Microsoft YaHei" w:eastAsia="Microsoft YaHei"/>
           <w:b/>
+          <w:color w:val="000000"/>
+          <w:sz w:val="16"/>
         </w:rPr>
-        <w:t xml:space="preserve">• </w:t>
+        <w:t xml:space="preserve">➢  </w:t>
       </w:r>
       <w:r>
-        <w:t>项目依赖覆盖 Knife4j、MyBatis-Plus、Redis、EasyExcel、WangEditor、xlsx 等能力，用于接口文档、数据访问、缓存、导入导出和富文本编辑等场景。</w:t>
+        <w:rPr>
+          <w:rFonts w:ascii="Microsoft YaHei" w:hAnsi="Microsoft YaHei" w:eastAsia="Microsoft YaHei"/>
+          <w:b w:val="0"/>
+          <w:color w:val="000000"/>
+          <w:sz w:val="16"/>
+        </w:rPr>
+        <w:t>项目依赖覆盖 Knife4j、EasyExcel、WangEditor、xlsx 等能力，用于接口文档、数据导入导出和富文本编辑等场景。</w:t>
       </w:r>
     </w:p>
     <w:p>
       <w:pPr>
-        <w:spacing w:after="20"/>
+        <w:spacing w:before="60" w:after="40"/>
       </w:pPr>
       <w:r>
         <w:rPr>
+          <w:rFonts w:ascii="Microsoft YaHei" w:hAnsi="Microsoft YaHei" w:eastAsia="Microsoft YaHei"/>
           <w:b/>
+          <w:color w:val="111111"/>
+          <w:sz w:val="20"/>
         </w:rPr>
         <w:t>养老服务与地区政策管理平台    全栈开发</w:t>
       </w:r>
     </w:p>
     <w:p>
       <w:pPr>
-        <w:spacing w:after="20"/>
-        <w:ind w:left="170" w:hanging="170"/>
+        <w:spacing w:after="40"/>
+        <w:ind w:left="425" w:hanging="198"/>
       </w:pPr>
       <w:r>
         <w:rPr>
+          <w:rFonts w:ascii="Microsoft YaHei" w:hAnsi="Microsoft YaHei" w:eastAsia="Microsoft YaHei"/>
           <w:b/>
+          <w:color w:val="000000"/>
+          <w:sz w:val="16"/>
         </w:rPr>
-        <w:t xml:space="preserve">• </w:t>
+        <w:t xml:space="preserve">➢  </w:t>
       </w:r>
       <w:r>
-        <w:t>技术栈：Java、Spring Boot、Spring Data JPA、MySQL、Vue 3、Element Plus、React、Next.js、Tailwind CSS、微信小程序</w:t>
+        <w:rPr>
+          <w:rFonts w:ascii="Microsoft YaHei" w:hAnsi="Microsoft YaHei" w:eastAsia="Microsoft YaHei"/>
+          <w:b w:val="0"/>
+          <w:color w:val="000000"/>
+          <w:sz w:val="16"/>
+        </w:rPr>
+        <w:t>技术栈：Spring Boot、Spring Data JPA、MySQL、Vue 3、Element Plus、React、Next.js、Tailwind CSS、微信小程序</w:t>
       </w:r>
     </w:p>
     <w:p>
       <w:pPr>
-        <w:spacing w:after="20"/>
-        <w:ind w:left="170" w:hanging="170"/>
+        <w:spacing w:after="40"/>
+        <w:ind w:left="425" w:hanging="198"/>
       </w:pPr>
       <w:r>
         <w:rPr>
+          <w:rFonts w:ascii="Microsoft YaHei" w:hAnsi="Microsoft YaHei" w:eastAsia="Microsoft YaHei"/>
           <w:b/>
+          <w:color w:val="000000"/>
+          <w:sz w:val="16"/>
         </w:rPr>
-        <w:t xml:space="preserve">• </w:t>
+        <w:t xml:space="preserve">➢  </w:t>
       </w:r>
       <w:r>
-        <w:t>参与养老服务配置平台开发，后端包含 Region、RegionPolicy、PaymentLevel、InterestRate、AgeSubsidy、AppSetting 等实体、Repository 和 Controller，支撑地区政策、缴费档次、利率与高龄补贴等管理能力。</w:t>
+        <w:rPr>
+          <w:rFonts w:ascii="Microsoft YaHei" w:hAnsi="Microsoft YaHei" w:eastAsia="Microsoft YaHei"/>
+          <w:b w:val="0"/>
+          <w:color w:val="000000"/>
+          <w:sz w:val="16"/>
+        </w:rPr>
+        <w:t>参与养老服务配置平台开发，后端包含 Region、RegionPolicy、PaymentLevel、InterestRate、AgeSubsidy、AppSetting 等领域对象，支撑地区政策、缴费档次和补贴配置。</w:t>
       </w:r>
     </w:p>
     <w:p>
       <w:pPr>
-        <w:spacing w:after="20"/>
-        <w:ind w:left="170" w:hanging="170"/>
+        <w:spacing w:after="40"/>
+        <w:ind w:left="425" w:hanging="198"/>
       </w:pPr>
       <w:r>
         <w:rPr>
+          <w:rFonts w:ascii="Microsoft YaHei" w:hAnsi="Microsoft YaHei" w:eastAsia="Microsoft YaHei"/>
           <w:b/>
+          <w:color w:val="000000"/>
+          <w:sz w:val="16"/>
         </w:rPr>
-        <w:t xml:space="preserve">• </w:t>
+        <w:t xml:space="preserve">➢  </w:t>
       </w:r>
       <w:r>
-        <w:t>维护 Vue 管理端的地区列表、地区详情、登录和应用设置页面，并与 Spring Boot 接口进行前后端联调；项目同时包含微信小程序前端目录。</w:t>
+        <w:rPr>
+          <w:rFonts w:ascii="Microsoft YaHei" w:hAnsi="Microsoft YaHei" w:eastAsia="Microsoft YaHei"/>
+          <w:b w:val="0"/>
+          <w:color w:val="000000"/>
+          <w:sz w:val="16"/>
+        </w:rPr>
+        <w:t>维护 Vue 管理端的地区列表、地区详情、登录和应用设置页面，并与 Spring Boot 接口联调；项目同时包含微信小程序和 Next.js 前端目录。</w:t>
       </w:r>
     </w:p>
     <w:p>
       <w:pPr>
-        <w:spacing w:after="20"/>
-        <w:ind w:left="170" w:hanging="170"/>
+        <w:spacing w:before="60" w:after="40"/>
       </w:pPr>
       <w:r>
         <w:rPr>
+          <w:rFonts w:ascii="Microsoft YaHei" w:hAnsi="Microsoft YaHei" w:eastAsia="Microsoft YaHei"/>
           <w:b/>
-        </w:rPr>
-        <w:t xml:space="preserve">• </w:t>
-      </w:r>
-      <w:r>
-        <w:t>项目中包含 Next.js App Router、shadcn/ui、Tailwind CSS、TypeScript 等前端目录，用于构建另一套全栈页面与组件体系。</w:t>
-      </w:r>
-    </w:p>
-    <w:p>
-      <w:pPr>
-        <w:spacing w:after="20"/>
-      </w:pPr>
-      <w:r>
-        <w:rPr>
-          <w:b/>
+          <w:color w:val="111111"/>
+          <w:sz w:val="20"/>
         </w:rPr>
         <w:t>ai-guoxue 国学知识库应用    全栈开发</w:t>
       </w:r>
     </w:p>
     <w:p>
       <w:pPr>
-        <w:spacing w:after="20"/>
-        <w:ind w:left="170" w:hanging="170"/>
+        <w:spacing w:after="40"/>
+        <w:ind w:left="425" w:hanging="198"/>
       </w:pPr>
       <w:r>
         <w:rPr>
+          <w:rFonts w:ascii="Microsoft YaHei" w:hAnsi="Microsoft YaHei" w:eastAsia="Microsoft YaHei"/>
           <w:b/>
+          <w:color w:val="000000"/>
+          <w:sz w:val="16"/>
         </w:rPr>
-        <w:t xml:space="preserve">• </w:t>
+        <w:t xml:space="preserve">➢  </w:t>
       </w:r>
       <w:r>
-        <w:t>技术栈：Java、Spring Boot、Spring Security、JWT、PostgreSQL、Vue 3、Vite、微信小程序</w:t>
+        <w:rPr>
+          <w:rFonts w:ascii="Microsoft YaHei" w:hAnsi="Microsoft YaHei" w:eastAsia="Microsoft YaHei"/>
+          <w:b w:val="0"/>
+          <w:color w:val="000000"/>
+          <w:sz w:val="16"/>
+        </w:rPr>
+        <w:t>技术栈：Spring Boot、Spring Security、JWT、PostgreSQL、Vue 3、Vite、微信小程序</w:t>
       </w:r>
     </w:p>
     <w:p>
       <w:pPr>
-        <w:spacing w:after="20"/>
-        <w:ind w:left="170" w:hanging="170"/>
+        <w:spacing w:after="40"/>
+        <w:ind w:left="425" w:hanging="198"/>
       </w:pPr>
       <w:r>
         <w:rPr>
+          <w:rFonts w:ascii="Microsoft YaHei" w:hAnsi="Microsoft YaHei" w:eastAsia="Microsoft YaHei"/>
           <w:b/>
+          <w:color w:val="000000"/>
+          <w:sz w:val="16"/>
         </w:rPr>
-        <w:t xml:space="preserve">• </w:t>
+        <w:t xml:space="preserve">➢  </w:t>
       </w:r>
       <w:r>
-        <w:t>参与国学知识库与课程类应用开发，后端使用 Spring Boot、PostgreSQL、Spring Security/JWT，管理端使用 Vue 3、Vite，项目包含微信小程序前端目录。</w:t>
+        <w:rPr>
+          <w:rFonts w:ascii="Microsoft YaHei" w:hAnsi="Microsoft YaHei" w:eastAsia="Microsoft YaHei"/>
+          <w:b w:val="0"/>
+          <w:color w:val="000000"/>
+          <w:sz w:val="16"/>
+        </w:rPr>
+        <w:t>参与国学知识库与课程类应用开发，后端使用 Spring Boot、PostgreSQL、Spring Security/JWT，管理端使用 Vue 3 与 Vite，项目包含微信小程序前端。</w:t>
       </w:r>
     </w:p>
     <w:p>
       <w:pPr>
-        <w:spacing w:after="20"/>
-        <w:ind w:left="170" w:hanging="170"/>
+        <w:spacing w:after="40"/>
+        <w:ind w:left="425" w:hanging="198"/>
       </w:pPr>
       <w:r>
         <w:rPr>
+          <w:rFonts w:ascii="Microsoft YaHei" w:hAnsi="Microsoft YaHei" w:eastAsia="Microsoft YaHei"/>
           <w:b/>
+          <w:color w:val="000000"/>
+          <w:sz w:val="16"/>
         </w:rPr>
-        <w:t xml:space="preserve">• </w:t>
+        <w:t xml:space="preserve">➢  </w:t>
       </w:r>
       <w:r>
-        <w:t>整理八星案例知识库文档，知识库索引包含 87 个 Markdown 文件以及 catalog、catalog.jsonl、chapter-index、topic-index、manifest 等索引文件。</w:t>
-      </w:r>
-    </w:p>
-    <w:p>
-      <w:pPr>
-        <w:spacing w:after="20"/>
-        <w:ind w:left="170" w:hanging="170"/>
-      </w:pPr>
-      <w:r>
         <w:rPr>
-          <w:b/>
+          <w:rFonts w:ascii="Microsoft YaHei" w:hAnsi="Microsoft YaHei" w:eastAsia="Microsoft YaHei"/>
+          <w:b w:val="0"/>
+          <w:color w:val="000000"/>
+          <w:sz w:val="16"/>
         </w:rPr>
-        <w:t xml:space="preserve">• </w:t>
-      </w:r>
-      <w:r>
-        <w:t>维护课程、内容、用户、支付、分销、阅读器和资料上传相关前端工具模块，项目目录包含 direct-oss-upload、chunked-upload、wechat-payment、distribution-api、course-payment 等实现线索。</w:t>
-      </w:r>
-    </w:p>
-    <w:p>
-      <w:pPr>
-        <w:spacing w:after="20"/>
-      </w:pPr>
-      <w:r>
-        <w:rPr>
-          <w:b/>
-        </w:rPr>
-        <w:t>Spring Cloud 服务调用 Demo    后端开发</w:t>
-      </w:r>
-    </w:p>
-    <w:p>
-      <w:pPr>
-        <w:spacing w:after="20"/>
-        <w:ind w:left="170" w:hanging="170"/>
-      </w:pPr>
-      <w:r>
-        <w:rPr>
-          <w:b/>
-        </w:rPr>
-        <w:t xml:space="preserve">• </w:t>
-      </w:r>
-      <w:r>
-        <w:t>技术栈：Java、Spring Boot、Spring Cloud、Spring Cloud Alibaba、Nacos、OpenFeign、Maven</w:t>
-      </w:r>
-    </w:p>
-    <w:p>
-      <w:pPr>
-        <w:spacing w:after="20"/>
-        <w:ind w:left="170" w:hanging="170"/>
-      </w:pPr>
-      <w:r>
-        <w:rPr>
-          <w:b/>
-        </w:rPr>
-        <w:t xml:space="preserve">• </w:t>
-      </w:r>
-      <w:r>
-        <w:t>搭建 Spring Cloud 服务调用示例，项目按 model、service-order、service-product 等模块拆分，使用 Spring Cloud Alibaba Nacos Discovery、OpenFeign 与 LoadBalancer 进行服务发现和调用。</w:t>
-      </w:r>
-    </w:p>
-    <w:p>
-      <w:pPr>
-        <w:spacing w:after="20"/>
-        <w:ind w:left="170" w:hanging="170"/>
-      </w:pPr>
-      <w:r>
-        <w:rPr>
-          <w:b/>
-        </w:rPr>
-        <w:t xml:space="preserve">• </w:t>
-      </w:r>
-      <w:r>
-        <w:t>通过 Maven 多模块结构组织公共模型与订单、商品服务，便于演示微服务之间的接口调用和依赖管理。</w:t>
-      </w:r>
-    </w:p>
-    <w:p>
-      <w:pPr>
-        <w:spacing w:before="160" w:after="60"/>
-      </w:pPr>
-      <w:r>
-        <w:rPr>
-          <w:b/>
-          <w:sz w:val="22"/>
-        </w:rPr>
-        <w:t>教育背景</w:t>
-      </w:r>
-    </w:p>
-    <w:p>
-      <w:pPr>
-        <w:spacing w:after="20"/>
-      </w:pPr>
-      <w:r>
-        <w:rPr>
-          <w:b/>
-        </w:rPr>
-        <w:t>软件工程</w:t>
+        <w:t>整理八星案例知识库文档，知识库索引包含 Markdown、catalog、chapter-index、topic-index、manifest 等文件，并维护课程、内容、用户、支付、分销和阅读器相关前端模块。</w:t>
       </w:r>
     </w:p>
     <w:sectPr>
       <w:pgSz w:w="12240" w:h="15840"/>
-      <w:pgMar w:top="794" w:right="907" w:bottom="794" w:left="907" w:header="720" w:footer="720" w:gutter="0"/>
+      <w:pgMar w:top="907" w:right="1020" w:bottom="794" w:left="1020" w:header="720" w:footer="720" w:gutter="0"/>
       <w:cols w:space="720"/>
       <w:docGrid w:linePitch="360"/>
     </w:sectPr>
@@ -888,8 +1365,8 @@
     <w:qFormat/>
     <w:rsid w:val="00FC693F"/>
     <w:rPr>
-      <w:rFonts w:ascii="Microsoft YaHei" w:hAnsi="Microsoft YaHei"/>
-      <w:sz w:val="18"/>
+      <w:rFonts w:ascii="Microsoft YaHei" w:hAnsi="Microsoft YaHei" w:eastAsia="Microsoft YaHei"/>
+      <w:sz w:val="19"/>
     </w:rPr>
   </w:style>
   <w:style w:type="paragraph" w:styleId="Header">

</xml_diff>